<commit_message>
update scripts: tighter rows
</commit_message>
<xml_diff>
--- a/GBT-26B-012/Operator_Instructions_for_Project_GBT26B-012.docx
+++ b/GBT-26B-012/Operator_Instructions_for_Project_GBT26B-012.docx
@@ -14,23 +14,21 @@
           <w:b/>
           <w:bCs/>
         </w:rPr>
-        <w:t xml:space="preserve">Operator Instructions for Project GBT-26B-012 — Salt in </w:t>
-      </w:r>
-      <w:proofErr w:type="spellStart"/>
+        <w:t xml:space="preserve">Operator Instructions for Project GBT-26B-012 </w:t>
+      </w:r>
       <w:r>
         <w:rPr>
           <w:b/>
           <w:bCs/>
         </w:rPr>
-        <w:t>Sgr</w:t>
-      </w:r>
-      <w:proofErr w:type="spellEnd"/>
+        <w:t xml:space="preserve">(AGBT/26B-087) </w:t>
+      </w:r>
       <w:r>
         <w:rPr>
           <w:b/>
           <w:bCs/>
         </w:rPr>
-        <w:t xml:space="preserve"> B2</w:t>
+        <w:t>— Salt in Sgr B2</w:t>
       </w:r>
     </w:p>
     <w:p>
@@ -84,15 +82,7 @@
         </w:numPr>
       </w:pPr>
       <w:r>
-        <w:t xml:space="preserve">configuration, </w:t>
-      </w:r>
-      <w:proofErr w:type="spellStart"/>
-      <w:r>
-        <w:t>autopeakfocus</w:t>
-      </w:r>
-      <w:proofErr w:type="spellEnd"/>
-      <w:r>
-        <w:t xml:space="preserve">, balance </w:t>
+        <w:t xml:space="preserve">configuration, autopeakfocus, balance </w:t>
       </w:r>
     </w:p>
     <w:p>
@@ -115,11 +105,9 @@
           <w:numId w:val="1"/>
         </w:numPr>
       </w:pPr>
-      <w:proofErr w:type="spellStart"/>
       <w:r>
         <w:t>autopeakfocus</w:t>
       </w:r>
-      <w:proofErr w:type="spellEnd"/>
     </w:p>
     <w:p>
       <w:pPr>
@@ -130,7 +118,13 @@
         </w:numPr>
       </w:pPr>
       <w:r>
-        <w:t>map dec</w:t>
+        <w:t xml:space="preserve">map </w:t>
+      </w:r>
+      <w:r>
+        <w:t>D</w:t>
+      </w:r>
+      <w:r>
+        <w:t>ec</w:t>
       </w:r>
     </w:p>
     <w:p>
@@ -209,15 +203,6 @@
     <w:p>
       <w:pPr>
         <w:pStyle w:val="ListParagraph"/>
-        <w:rPr>
-          <w:i/>
-          <w:iCs/>
-        </w:rPr>
-      </w:pPr>
-    </w:p>
-    <w:p>
-      <w:pPr>
-        <w:pStyle w:val="ListParagraph"/>
       </w:pPr>
     </w:p>
     <w:p>
@@ -235,23 +220,6 @@
           <w:bCs/>
         </w:rPr>
         <w:t xml:space="preserve">Finishing early: </w:t>
-      </w:r>
-    </w:p>
-    <w:p>
-      <w:pPr>
-        <w:pStyle w:val="ListParagraph"/>
-        <w:numPr>
-          <w:ilvl w:val="1"/>
-          <w:numId w:val="1"/>
-        </w:numPr>
-        <w:ind w:left="720"/>
-        <w:rPr>
-          <w:i/>
-          <w:iCs/>
-        </w:rPr>
-      </w:pPr>
-      <w:r>
-        <w:t xml:space="preserve">Each OTF row scan takes under two minutes (48.5 s for Ku, 97 s for K). </w:t>
       </w:r>
     </w:p>
     <w:p>
@@ -268,7 +236,10 @@
         </w:rPr>
       </w:pPr>
       <w:r>
-        <w:t>The script’s map count is sized for about one 3-hour session. Log how many maps you completed so the running total can be updated (Ku: out of 131 total; K: see the total noted in the script’s header) — the next session needs to know how many remain.</w:t>
+        <w:t>Each OTF row scan takes under two minutes (48.5 s for Ku, 97 s for K)</w:t>
+      </w:r>
+      <w:r>
+        <w:t>.  Any full scan row is useful</w:t>
       </w:r>
     </w:p>
     <w:p>
@@ -309,13 +280,18 @@
           <w:ilvl w:val="1"/>
           <w:numId w:val="2"/>
         </w:numPr>
-        <w:rPr>
-          <w:i/>
-          <w:iCs/>
-        </w:rPr>
-      </w:pPr>
-      <w:r>
-        <w:t>If no source is found, allow the routine to search a wider radius until one is found (AutoPeakFocus auto-selects a nearby pointing source near the science frequency).</w:t>
+      </w:pPr>
+      <w:r>
+        <w:t xml:space="preserve">If no source is found, allow the routine to search a wider radius until one is found </w:t>
+      </w:r>
+      <w:r>
+        <w:t>(this is only needed if you are allowing astrid to choose the</w:t>
+      </w:r>
+      <w:r>
+        <w:t xml:space="preserve"> </w:t>
+      </w:r>
+      <w:r>
+        <w:t>source)</w:t>
       </w:r>
     </w:p>
     <w:p>
@@ -435,7 +411,6 @@
         </w:numPr>
       </w:pPr>
       <w:r>
-        <w:lastRenderedPageBreak/>
         <w:t xml:space="preserve">PI: </w:t>
       </w:r>
       <w:r>

</xml_diff>